<commit_message>
docs(a07): encourage any LLM in the assignment guidelines
Replaces the z.ai-only instruction with an explicit encouragement to use
ChatGPT, Claude, Gemini or another LLM when exploring the questions.
</commit_message>
<xml_diff>
--- a/assignments/07-assignment.docx
+++ b/assignments/07-assignment.docx
@@ -90,7 +90,23 @@
         </w:numPr>
       </w:pPr>
       <w:r>
-        <w:t xml:space="preserve">You are also welcome to use other LLMs (ChatGPT, Claude, Gemini) for exploring the reflection questions, but the main tasks should be done on z.ai</w:t>
+        <w:t xml:space="preserve">You are</w:t>
+      </w:r>
+      <w:r>
+        <w:t xml:space="preserve"> </w:t>
+      </w:r>
+      <w:r>
+        <w:rPr>
+          <w:b/>
+          <w:bCs/>
+        </w:rPr>
+        <w:t xml:space="preserve">encouraged</w:t>
+      </w:r>
+      <w:r>
+        <w:t xml:space="preserve"> </w:t>
+      </w:r>
+      <w:r>
+        <w:t xml:space="preserve">to use ChatGPT, Claude, Gemini, or other LLMs to help you explore these questions</w:t>
       </w:r>
     </w:p>
     <w:p>

</xml_diff>